<commit_message>
nmv 09 03 2026
</commit_message>
<xml_diff>
--- a/brAhmaNa/TB 3.1-3.6 Malayalam Corrections.docx
+++ b/brAhmaNa/TB 3.1-3.6 Malayalam Corrections.docx
@@ -22,7 +22,29 @@
           <w:szCs w:val="32"/>
           <w:u w:val="single"/>
         </w:rPr>
-        <w:t xml:space="preserve">TaittirIya BrAhmaNam TB 3.1 – 3.6  Book </w:t>
+        <w:t xml:space="preserve">TaittirIya BrAhmaNam TB 3.1 – </w:t>
+      </w:r>
+      <w:proofErr w:type="gramStart"/>
+      <w:r>
+        <w:rPr>
+          <w:b/>
+          <w:bCs/>
+          <w:sz w:val="28"/>
+          <w:szCs w:val="32"/>
+          <w:u w:val="single"/>
+        </w:rPr>
+        <w:t>3.6  Book</w:t>
+      </w:r>
+      <w:proofErr w:type="gramEnd"/>
+      <w:r>
+        <w:rPr>
+          <w:b/>
+          <w:bCs/>
+          <w:sz w:val="28"/>
+          <w:szCs w:val="32"/>
+          <w:u w:val="single"/>
+        </w:rPr>
+        <w:t xml:space="preserve"> </w:t>
       </w:r>
       <w:r>
         <w:rPr>
@@ -42,7 +64,7 @@
           <w:szCs w:val="32"/>
           <w:u w:val="single"/>
         </w:rPr>
-        <w:t xml:space="preserve"> Corrections – Observed till </w:t>
+        <w:t xml:space="preserve"> Corrections – Observed til</w:t>
       </w:r>
       <w:r>
         <w:rPr>
@@ -50,10 +72,30 @@
           <w:bCs/>
           <w:sz w:val="28"/>
           <w:szCs w:val="32"/>
-          <w:highlight w:val="red"/>
           <w:u w:val="single"/>
         </w:rPr>
-        <w:t>?????</w:t>
+        <w:t xml:space="preserve"> 28</w:t>
+      </w:r>
+      <w:r>
+        <w:rPr>
+          <w:b/>
+          <w:bCs/>
+          <w:sz w:val="28"/>
+          <w:szCs w:val="32"/>
+          <w:u w:val="single"/>
+          <w:vertAlign w:val="superscript"/>
+        </w:rPr>
+        <w:t>th</w:t>
+      </w:r>
+      <w:r>
+        <w:rPr>
+          <w:b/>
+          <w:bCs/>
+          <w:sz w:val="28"/>
+          <w:szCs w:val="32"/>
+          <w:u w:val="single"/>
+        </w:rPr>
+        <w:t xml:space="preserve"> Feb 2026</w:t>
       </w:r>
     </w:p>
     <w:p>
@@ -2338,6 +2380,17 @@
           <w:lang w:val="it-IT"/>
         </w:rPr>
       </w:pPr>
+      <w:r>
+        <w:rPr>
+          <w:b/>
+          <w:bCs/>
+          <w:sz w:val="28"/>
+          <w:szCs w:val="32"/>
+          <w:u w:val="single"/>
+          <w:lang w:val="it-IT"/>
+        </w:rPr>
+        <w:t>===================</w:t>
+      </w:r>
     </w:p>
     <w:p>
       <w:pPr>
@@ -2373,7 +2426,29 @@
           <w:szCs w:val="32"/>
           <w:u w:val="single"/>
         </w:rPr>
-        <w:t xml:space="preserve">TaittirIya BrAhmaNam TB 3.1 – 3.6  Book </w:t>
+        <w:t xml:space="preserve">TaittirIya BrAhmaNam TB 3.1 – </w:t>
+      </w:r>
+      <w:proofErr w:type="gramStart"/>
+      <w:r>
+        <w:rPr>
+          <w:b/>
+          <w:bCs/>
+          <w:sz w:val="28"/>
+          <w:szCs w:val="32"/>
+          <w:u w:val="single"/>
+        </w:rPr>
+        <w:t>3.6  Book</w:t>
+      </w:r>
+      <w:proofErr w:type="gramEnd"/>
+      <w:r>
+        <w:rPr>
+          <w:b/>
+          <w:bCs/>
+          <w:sz w:val="28"/>
+          <w:szCs w:val="32"/>
+          <w:u w:val="single"/>
+        </w:rPr>
+        <w:t xml:space="preserve"> </w:t>
       </w:r>
       <w:r>
         <w:rPr>
@@ -7370,6 +7445,20 @@
           <w:sz w:val="32"/>
           <w:szCs w:val="32"/>
           <w:u w:val="single"/>
+          <w:lang w:val="en-IN"/>
+        </w:rPr>
+      </w:pPr>
+    </w:p>
+    <w:p>
+      <w:pPr>
+        <w:spacing w:before="0"/>
+        <w:jc w:val="center"/>
+        <w:rPr>
+          <w:b/>
+          <w:bCs/>
+          <w:sz w:val="32"/>
+          <w:szCs w:val="32"/>
+          <w:u w:val="single"/>
         </w:rPr>
       </w:pPr>
       <w:r>
@@ -7380,6 +7469,7 @@
           <w:szCs w:val="32"/>
           <w:u w:val="single"/>
         </w:rPr>
+        <w:lastRenderedPageBreak/>
         <w:t xml:space="preserve">TaittirIya BrAhmaNam TB </w:t>
       </w:r>
       <w:r>
@@ -7402,6 +7492,7 @@
         </w:rPr>
         <w:t xml:space="preserve"> </w:t>
       </w:r>
+      <w:proofErr w:type="gramStart"/>
       <w:r>
         <w:rPr>
           <w:b/>
@@ -7422,6 +7513,7 @@
         </w:rPr>
         <w:t xml:space="preserve">  Book</w:t>
       </w:r>
+      <w:proofErr w:type="gramEnd"/>
       <w:r>
         <w:rPr>
           <w:b/>
@@ -7453,7 +7545,6 @@
           <w:szCs w:val="32"/>
           <w:u w:val="single"/>
         </w:rPr>
-        <w:lastRenderedPageBreak/>
         <w:t>Malayalam</w:t>
       </w:r>
       <w:r>
@@ -12646,6 +12737,7 @@
         </w:rPr>
         <w:t xml:space="preserve"> </w:t>
       </w:r>
+      <w:proofErr w:type="gramStart"/>
       <w:r>
         <w:rPr>
           <w:b/>
@@ -12666,6 +12758,7 @@
         </w:rPr>
         <w:t xml:space="preserve">  Book</w:t>
       </w:r>
+      <w:proofErr w:type="gramEnd"/>
       <w:r>
         <w:rPr>
           <w:b/>

</xml_diff>